<commit_message>
feat: move search module to left, reposition my-location to bottom-right, and redesign curation banners
</commit_message>
<xml_diff>
--- a/docs/지역축제_서비스_기획_정의서.docx
+++ b/docs/지역축제_서비스_기획_정의서.docx
@@ -379,7 +379,7 @@
         <w:spacing w:after="100" w:before="200"/>
       </w:pPr>
       <w:r>
-        <w:t xml:space="preserve">2.2. 전면 풀사이즈 지도 영역</w:t>
+        <w:t xml:space="preserve">2.2. 전면 풀사이즈 지도 및 내 위치 컨트롤</w:t>
       </w:r>
     </w:p>
     <w:p>
@@ -407,15 +407,15 @@
           <w:sz w:val="22"/>
           <w:szCs w:val="22"/>
         </w:rPr>
-        <w:t xml:space="preserve">화면 크기</w:t>
-      </w:r>
-      <w:r>
-        <w:rPr>
-          <w:rFonts w:ascii="Malgun Gothic" w:cs="Malgun Gothic" w:eastAsia="Malgun Gothic" w:hAnsi="Malgun Gothic"/>
-          <w:sz w:val="22"/>
-          <w:szCs w:val="22"/>
-        </w:rPr>
-        <w:t xml:space="preserve">: 브라우저 뷰포트 전체 높이에 맞춤 (`calc(100vh - 56px)`).</w:t>
+        <w:t xml:space="preserve">지도 상단 말풍선 제거</w:t>
+      </w:r>
+      <w:r>
+        <w:rPr>
+          <w:rFonts w:ascii="Malgun Gothic" w:cs="Malgun Gothic" w:eastAsia="Malgun Gothic" w:hAnsi="Malgun Gothic"/>
+          <w:sz w:val="22"/>
+          <w:szCs w:val="22"/>
+        </w:rPr>
+        <w:t xml:space="preserve">: 불필요한 시야 방해 요소인 '전국 실시간 축제 지도' 안내 말풍선은 전면 삭제함.</w:t>
       </w:r>
     </w:p>
     <w:p>
@@ -443,7 +443,7 @@
           <w:sz w:val="22"/>
           <w:szCs w:val="22"/>
         </w:rPr>
-        <w:t xml:space="preserve">지도 컨트롤 및 인터랙션</w:t>
+        <w:t xml:space="preserve">내 위치 이동 버튼</w:t>
       </w:r>
       <w:r>
         <w:rPr>
@@ -469,7 +469,61 @@
           <w:sz w:val="22"/>
           <w:szCs w:val="22"/>
         </w:rPr>
-        <w:t xml:space="preserve">전국 단위 초기 좌표 로드 및 사용자 위치 기반 GPS 이동 지원함.</w:t>
+        <w:t xml:space="preserve">우측 하단(`bottom-6 right-6`)에 고정 배치하여 엄지손가락 및 마우스 조작 편의성을 극대화함.</w:t>
+      </w:r>
+    </w:p>
+    <w:p>
+      <w:pPr>
+        <w:pStyle w:val="ListParagraph"/>
+        <w:numPr>
+          <w:ilvl w:val="1"/>
+          <w:numId w:val="1"/>
+        </w:numPr>
+        <w:spacing w:after="60" w:before="60"/>
+      </w:pPr>
+      <w:r>
+        <w:rPr>
+          <w:rFonts w:ascii="Malgun Gothic" w:cs="Malgun Gothic" w:eastAsia="Malgun Gothic" w:hAnsi="Malgun Gothic"/>
+          <w:sz w:val="22"/>
+          <w:szCs w:val="22"/>
+        </w:rPr>
+        <w:t xml:space="preserve">클릭 시 사용자 브라우저 GPS 좌표를 획득하여 해당 위치로 지도 중심 이동 및 마커 포커싱 처리함.</w:t>
+      </w:r>
+    </w:p>
+    <w:p>
+      <w:pPr>
+        <w:pStyle w:val="ListParagraph"/>
+        <w:numPr>
+          <w:ilvl w:val="0"/>
+          <w:numId w:val="1"/>
+        </w:numPr>
+        <w:spacing w:after="60" w:before="60"/>
+      </w:pPr>
+      <w:r>
+        <w:rPr>
+          <w:rFonts w:ascii="Malgun Gothic" w:cs="Malgun Gothic" w:eastAsia="Malgun Gothic" w:hAnsi="Malgun Gothic"/>
+          <w:sz w:val="22"/>
+          <w:szCs w:val="22"/>
+        </w:rPr>
+        <w:t xml:space="preserve"/>
+      </w:r>
+      <w:r>
+        <w:rPr>
+          <w:rFonts w:ascii="Malgun Gothic" w:cs="Malgun Gothic" w:eastAsia="Malgun Gothic" w:hAnsi="Malgun Gothic"/>
+          <w:b/>
+          <w:bCs/>
+          <w:sz w:val="22"/>
+          <w:szCs w:val="22"/>
+        </w:rPr>
+        <w:t xml:space="preserve">지도 인터랙션</w:t>
+      </w:r>
+      <w:r>
+        <w:rPr>
+          <w:rFonts w:ascii="Malgun Gothic" w:cs="Malgun Gothic" w:eastAsia="Malgun Gothic" w:hAnsi="Malgun Gothic"/>
+          <w:sz w:val="22"/>
+          <w:szCs w:val="22"/>
+        </w:rPr>
+        <w:t xml:space="preserve">:</w:t>
       </w:r>
     </w:p>
     <w:p>
@@ -532,7 +586,7 @@
         <w:spacing w:after="100" w:before="200"/>
       </w:pPr>
       <w:r>
-        <w:t xml:space="preserve">2.3. 우측 검색 및 필터 패널 (PC 환경)</w:t>
+        <w:t xml:space="preserve">2.3. 좌측 검색 및 추천 필터 모듈 (PC 환경)</w:t>
       </w:r>
     </w:p>
     <w:p>
@@ -568,7 +622,7 @@
           <w:sz w:val="22"/>
           <w:szCs w:val="22"/>
         </w:rPr>
-        <w:t xml:space="preserve">: 지도 우측 상단 플로팅 오버레이 패널 (접기/펼치기 토글 지원함).</w:t>
+        <w:t xml:space="preserve">: 지도 좌측 상단 플로팅 오버레이 패널 (`top-3 left-3 bottom-3`, 패널 우측 토글 탭 버튼 지원함).</w:t>
       </w:r>
     </w:p>
     <w:p>
@@ -637,7 +691,7 @@
           <w:sz w:val="22"/>
           <w:szCs w:val="22"/>
         </w:rPr>
-        <w:t xml:space="preserve">패널 상단 유틸리티 바</w:t>
+        <w:t xml:space="preserve">모듈 헤더 유틸리티</w:t>
       </w:r>
       <w:r>
         <w:rPr>
@@ -663,7 +717,7 @@
           <w:sz w:val="22"/>
           <w:szCs w:val="22"/>
         </w:rPr>
-        <w:t xml:space="preserve">축제 검색 결과 건수 표기 (`화면 내 축제 N개`).</w:t>
+        <w:t xml:space="preserve">결과 건수 표기: 기존 '화면 내 축제' 대신 `축제 검색결과` 문구로 직관성 부여함.</w:t>
       </w:r>
     </w:p>
     <w:p>
@@ -699,7 +753,7 @@
           <w:sz w:val="22"/>
           <w:szCs w:val="22"/>
         </w:rPr>
-        <w:t xml:space="preserve">: 우측 상단에 배치 (`새로고침/초기화` 아이콘 + `초기화` 텍스트). 클릭 시 검색어 빈값, 추천 칩 해제, 일정 탭 '전체 일정', 상태 '진행 중' 기본값으로 원클릭 리셋됨.</w:t>
+        <w:t xml:space="preserve">: 우측 상단에 배치 (`새로고침` 아이콘 + `초기화` 텍스트). 클릭 시 검색어 빈값, 추천 배너 토글 해제, 일정 탭 '전체 일정', 상태 '진행 중' 기본값으로 원클릭 리셋됨.</w:t>
       </w:r>
     </w:p>
     <w:p>
@@ -827,7 +881,7 @@
           <w:sz w:val="22"/>
           <w:szCs w:val="22"/>
         </w:rPr>
-        <w:t xml:space="preserve">추천 테마 칩 버튼 (검색 단축키)</w:t>
+        <w:t xml:space="preserve">추천 배너 3종 (세로 나열 가로형 배너 디자인)</w:t>
       </w:r>
       <w:r>
         <w:rPr>
@@ -853,43 +907,97 @@
           <w:sz w:val="22"/>
           <w:szCs w:val="22"/>
         </w:rPr>
-        <w:t xml:space="preserve">`'전체'` 칩 배제 (단축키 토글 개념으로 동작).</w:t>
-      </w:r>
-    </w:p>
-    <w:p>
-      <w:pPr>
-        <w:pStyle w:val="ListParagraph"/>
-        <w:numPr>
-          <w:ilvl w:val="1"/>
-          <w:numId w:val="1"/>
-        </w:numPr>
-        <w:spacing w:after="60" w:before="60"/>
-      </w:pPr>
-      <w:r>
-        <w:rPr>
-          <w:rFonts w:ascii="Malgun Gothic" w:cs="Malgun Gothic" w:eastAsia="Malgun Gothic" w:hAnsi="Malgun Gothic"/>
-          <w:sz w:val="22"/>
-          <w:szCs w:val="22"/>
-        </w:rPr>
-        <w:t xml:space="preserve">구성: `[🔥 HOT 10]`, `[🎵 뮤직&amp;페스티벌]`, `[🌙 야간·빛]`, `[👨‍👩‍👧 가족·체험]`</w:t>
-      </w:r>
-    </w:p>
-    <w:p>
-      <w:pPr>
-        <w:pStyle w:val="ListParagraph"/>
-        <w:numPr>
-          <w:ilvl w:val="1"/>
-          <w:numId w:val="1"/>
-        </w:numPr>
-        <w:spacing w:after="60" w:before="60"/>
-      </w:pPr>
-      <w:r>
-        <w:rPr>
-          <w:rFonts w:ascii="Malgun Gothic" w:cs="Malgun Gothic" w:eastAsia="Malgun Gothic" w:hAnsi="Malgun Gothic"/>
-          <w:sz w:val="22"/>
-          <w:szCs w:val="22"/>
-        </w:rPr>
-        <w:t xml:space="preserve">클릭 시 해당 단축키가 활성화되며, 활성화된 추천 칩을 다시 누르면 토글 해제(일반 검색 모드 복귀)됨.</w:t>
+        <w:t xml:space="preserve">'추천목록' 텍스트 레이블은 전면 삭제하여 화면 군더더기를 제거함.</w:t>
+      </w:r>
+    </w:p>
+    <w:p>
+      <w:pPr>
+        <w:pStyle w:val="ListParagraph"/>
+        <w:numPr>
+          <w:ilvl w:val="1"/>
+          <w:numId w:val="1"/>
+        </w:numPr>
+        <w:spacing w:after="60" w:before="60"/>
+      </w:pPr>
+      <w:r>
+        <w:rPr>
+          <w:rFonts w:ascii="Malgun Gothic" w:cs="Malgun Gothic" w:eastAsia="Malgun Gothic" w:hAnsi="Malgun Gothic"/>
+          <w:sz w:val="22"/>
+          <w:szCs w:val="22"/>
+        </w:rPr>
+        <w:t xml:space="preserve">기존 4종 중 4번(가족·체험)을 삭제하고 핵심 3종으로 압축함:</w:t>
+      </w:r>
+    </w:p>
+    <w:p>
+      <w:pPr>
+        <w:pStyle w:val="ListParagraph"/>
+        <w:numPr>
+          <w:ilvl w:val="1"/>
+          <w:numId w:val="1"/>
+        </w:numPr>
+        <w:spacing w:after="60" w:before="60"/>
+      </w:pPr>
+      <w:r>
+        <w:rPr>
+          <w:rFonts w:ascii="Malgun Gothic" w:cs="Malgun Gothic" w:eastAsia="Malgun Gothic" w:hAnsi="Malgun Gothic"/>
+          <w:sz w:val="22"/>
+          <w:szCs w:val="22"/>
+        </w:rPr>
+        <w:t xml:space="preserve">`[HOT 10 축제]`: 지금 가장 주목받는 인기 축제 (오렌지/앰버 그라데이션 배너)</w:t>
+      </w:r>
+    </w:p>
+    <w:p>
+      <w:pPr>
+        <w:pStyle w:val="ListParagraph"/>
+        <w:numPr>
+          <w:ilvl w:val="1"/>
+          <w:numId w:val="1"/>
+        </w:numPr>
+        <w:spacing w:after="60" w:before="60"/>
+      </w:pPr>
+      <w:r>
+        <w:rPr>
+          <w:rFonts w:ascii="Malgun Gothic" w:cs="Malgun Gothic" w:eastAsia="Malgun Gothic" w:hAnsi="Malgun Gothic"/>
+          <w:sz w:val="22"/>
+          <w:szCs w:val="22"/>
+        </w:rPr>
+        <w:t xml:space="preserve">`[뮤직 &amp; 페스티벌]`: 음악·공연·버스킹·락 축제 (블루/인디고 그라데이션 배너)</w:t>
+      </w:r>
+    </w:p>
+    <w:p>
+      <w:pPr>
+        <w:pStyle w:val="ListParagraph"/>
+        <w:numPr>
+          <w:ilvl w:val="1"/>
+          <w:numId w:val="1"/>
+        </w:numPr>
+        <w:spacing w:after="60" w:before="60"/>
+      </w:pPr>
+      <w:r>
+        <w:rPr>
+          <w:rFonts w:ascii="Malgun Gothic" w:cs="Malgun Gothic" w:eastAsia="Malgun Gothic" w:hAnsi="Malgun Gothic"/>
+          <w:sz w:val="22"/>
+          <w:szCs w:val="22"/>
+        </w:rPr>
+        <w:t xml:space="preserve">`[야간 &amp; 빛 축제]`: 낭만 가득 불꽃·달빛·드론쇼 (퍼플/네이비 그라데이션 배너)</w:t>
+      </w:r>
+    </w:p>
+    <w:p>
+      <w:pPr>
+        <w:pStyle w:val="ListParagraph"/>
+        <w:numPr>
+          <w:ilvl w:val="1"/>
+          <w:numId w:val="1"/>
+        </w:numPr>
+        <w:spacing w:after="60" w:before="60"/>
+      </w:pPr>
+      <w:r>
+        <w:rPr>
+          <w:rFonts w:ascii="Malgun Gothic" w:cs="Malgun Gothic" w:eastAsia="Malgun Gothic" w:hAnsi="Malgun Gothic"/>
+          <w:sz w:val="22"/>
+          <w:szCs w:val="22"/>
+        </w:rPr>
+        <w:t xml:space="preserve">배너 클릭 시 해당 테마가 원터치 필터링되며, 활성화 상태에서 재클릭 시 필터가 해제되는 토글 방식으로 작동함.</w:t>
       </w:r>
     </w:p>
     <w:p>
@@ -1023,65 +1131,6 @@
           <w:szCs w:val="22"/>
         </w:rPr>
         <w:t xml:space="preserve">6. </w:t>
-      </w:r>
-      <w:r>
-        <w:rPr>
-          <w:rFonts w:ascii="Malgun Gothic" w:cs="Malgun Gothic" w:eastAsia="Malgun Gothic" w:hAnsi="Malgun Gothic"/>
-          <w:sz w:val="22"/>
-          <w:szCs w:val="22"/>
-        </w:rPr>
-        <w:t xml:space="preserve"/>
-      </w:r>
-      <w:r>
-        <w:rPr>
-          <w:rFonts w:ascii="Malgun Gothic" w:cs="Malgun Gothic" w:eastAsia="Malgun Gothic" w:hAnsi="Malgun Gothic"/>
-          <w:b/>
-          <w:bCs/>
-          <w:sz w:val="22"/>
-          <w:szCs w:val="22"/>
-        </w:rPr>
-        <w:t xml:space="preserve">지역 버튼 삭제</w:t>
-      </w:r>
-      <w:r>
-        <w:rPr>
-          <w:rFonts w:ascii="Malgun Gothic" w:cs="Malgun Gothic" w:eastAsia="Malgun Gothic" w:hAnsi="Malgun Gothic"/>
-          <w:sz w:val="22"/>
-          <w:szCs w:val="22"/>
-        </w:rPr>
-        <w:t xml:space="preserve">:</w:t>
-      </w:r>
-    </w:p>
-    <w:p>
-      <w:pPr>
-        <w:pStyle w:val="ListParagraph"/>
-        <w:numPr>
-          <w:ilvl w:val="1"/>
-          <w:numId w:val="1"/>
-        </w:numPr>
-        <w:spacing w:after="60" w:before="60"/>
-      </w:pPr>
-      <w:r>
-        <w:rPr>
-          <w:rFonts w:ascii="Malgun Gothic" w:cs="Malgun Gothic" w:eastAsia="Malgun Gothic" w:hAnsi="Malgun Gothic"/>
-          <w:sz w:val="22"/>
-          <w:szCs w:val="22"/>
-        </w:rPr>
-        <w:t xml:space="preserve">기존 상단 시/도 단위 지역 선택 칩 버튼은 전면 삭제함.</w:t>
-      </w:r>
-    </w:p>
-    <w:p>
-      <w:pPr>
-        <w:spacing w:after="60" w:before="60"/>
-      </w:pPr>
-      <w:r>
-        <w:rPr>
-          <w:rFonts w:ascii="Malgun Gothic" w:cs="Malgun Gothic" w:eastAsia="Malgun Gothic" w:hAnsi="Malgun Gothic"/>
-          <w:b/>
-          <w:bCs/>
-          <w:sz w:val="22"/>
-          <w:szCs w:val="22"/>
-        </w:rPr>
-        <w:t xml:space="preserve">7. </w:t>
       </w:r>
       <w:r>
         <w:rPr>
@@ -1170,7 +1219,7 @@
           <w:sz w:val="22"/>
           <w:szCs w:val="22"/>
         </w:rPr>
-        <w:t xml:space="preserve">: 모바일에서도 지도가 전체 화면을 차지하며 상단에 검색 바 및 필터 진입 버튼 배치함.</w:t>
+        <w:t xml:space="preserve">: 모바일에서도 지도가 전체 화면을 차지하며 상단에 검색 바 및 우측 내 위치 버튼 배치함.</w:t>
       </w:r>
     </w:p>
     <w:p>
@@ -1198,7 +1247,7 @@
           <w:sz w:val="22"/>
           <w:szCs w:val="22"/>
         </w:rPr>
-        <w:t xml:space="preserve">목록 전체 덮기 팝업 (Full Overlay)</w:t>
+        <w:t xml:space="preserve">축제 검색결과 전체 덮기 팝업 (Full Overlay)</w:t>
       </w:r>
       <w:r>
         <w:rPr>
@@ -1224,7 +1273,7 @@
           <w:sz w:val="22"/>
           <w:szCs w:val="22"/>
         </w:rPr>
-        <w:t xml:space="preserve">검색창 터치 시 모바일 화면 전체를 덮는 축제 검색/추천 목록 팝업창 활성화됨.</w:t>
+        <w:t xml:space="preserve">상단 검색창 터치 시 모바일 화면 전체를 덮는 축제 검색결과 및 추천 배너 목록 활성화됨.</w:t>
       </w:r>
     </w:p>
     <w:p>
@@ -1259,7 +1308,7 @@
         <w:spacing w:after="140" w:before="280"/>
       </w:pPr>
       <w:r>
-        <w:t xml:space="preserve">3. 추천 테마(단축키) 데이터 필터링 규칙</w:t>
+        <w:t xml:space="preserve">3. 추천 테마 데이터 필터링 규칙</w:t>
       </w:r>
     </w:p>
     <w:p>
@@ -1292,7 +1341,7 @@
           <w:sz w:val="22"/>
           <w:szCs w:val="22"/>
         </w:rPr>
-        <w:t xml:space="preserve">[HOT 10]</w:t>
+        <w:t xml:space="preserve">[HOT 10 축제]</w:t>
       </w:r>
       <w:r>
         <w:rPr>
@@ -1410,7 +1459,7 @@
           <w:sz w:val="22"/>
           <w:szCs w:val="22"/>
         </w:rPr>
-        <w:t xml:space="preserve">[야간·빛]</w:t>
+        <w:t xml:space="preserve">[야간 &amp; 빛 축제]</w:t>
       </w:r>
       <w:r>
         <w:rPr>
@@ -1437,118 +1486,6 @@
           <w:szCs w:val="22"/>
         </w:rPr>
         <w:t xml:space="preserve">`title` 또는 `overview` 정규식 `야간|빛|불꽃|달빛|밤|나이트|드론` 매칭.</w:t>
-      </w:r>
-    </w:p>
-    <w:p>
-      <w:pPr>
-        <w:spacing w:after="60" w:before="60"/>
-      </w:pPr>
-      <w:r>
-        <w:rPr>
-          <w:rFonts w:ascii="Malgun Gothic" w:cs="Malgun Gothic" w:eastAsia="Malgun Gothic" w:hAnsi="Malgun Gothic"/>
-          <w:b/>
-          <w:bCs/>
-          <w:sz w:val="22"/>
-          <w:szCs w:val="22"/>
-        </w:rPr>
-        <w:t xml:space="preserve">4. </w:t>
-      </w:r>
-      <w:r>
-        <w:rPr>
-          <w:rFonts w:ascii="Malgun Gothic" w:cs="Malgun Gothic" w:eastAsia="Malgun Gothic" w:hAnsi="Malgun Gothic"/>
-          <w:sz w:val="22"/>
-          <w:szCs w:val="22"/>
-        </w:rPr>
-        <w:t xml:space="preserve"/>
-      </w:r>
-      <w:r>
-        <w:rPr>
-          <w:rFonts w:ascii="Malgun Gothic" w:cs="Malgun Gothic" w:eastAsia="Malgun Gothic" w:hAnsi="Malgun Gothic"/>
-          <w:b/>
-          <w:bCs/>
-          <w:sz w:val="22"/>
-          <w:szCs w:val="22"/>
-        </w:rPr>
-        <w:t xml:space="preserve">[가족·체험]</w:t>
-      </w:r>
-      <w:r>
-        <w:rPr>
-          <w:rFonts w:ascii="Malgun Gothic" w:cs="Malgun Gothic" w:eastAsia="Malgun Gothic" w:hAnsi="Malgun Gothic"/>
-          <w:sz w:val="22"/>
-          <w:szCs w:val="22"/>
-        </w:rPr>
-        <w:t xml:space="preserve">:</w:t>
-      </w:r>
-    </w:p>
-    <w:p>
-      <w:pPr>
-        <w:pStyle w:val="ListParagraph"/>
-        <w:numPr>
-          <w:ilvl w:val="1"/>
-          <w:numId w:val="1"/>
-        </w:numPr>
-        <w:spacing w:after="60" w:before="60"/>
-      </w:pPr>
-      <w:r>
-        <w:rPr>
-          <w:rFonts w:ascii="Malgun Gothic" w:cs="Malgun Gothic" w:eastAsia="Malgun Gothic" w:hAnsi="Malgun Gothic"/>
-          <w:sz w:val="22"/>
-          <w:szCs w:val="22"/>
-        </w:rPr>
-        <w:t xml:space="preserve">`title` 또는 `overview` 정규식 `어린이|가족|만화|체험|공룡|인형|생태|키즈` 매칭.</w:t>
-      </w:r>
-    </w:p>
-    <w:p>
-      <w:pPr>
-        <w:pBdr>
-          <w:bottom w:val="single" w:color="CBD5E1" w:sz="6" w:space="1"/>
-        </w:pBdr>
-        <w:spacing w:after="100" w:before="100"/>
-      </w:pPr>
-    </w:p>
-    <w:p>
-      <w:pPr>
-        <w:pStyle w:val="Heading1"/>
-        <w:spacing w:after="140" w:before="280"/>
-      </w:pPr>
-      <w:r>
-        <w:t xml:space="preserve">4. 축제 상세 화면 구성 사양</w:t>
-      </w:r>
-    </w:p>
-    <w:p>
-      <w:pPr>
-        <w:pStyle w:val="ListParagraph"/>
-        <w:numPr>
-          <w:ilvl w:val="0"/>
-          <w:numId w:val="1"/>
-        </w:numPr>
-        <w:spacing w:after="60" w:before="60"/>
-      </w:pPr>
-      <w:r>
-        <w:rPr>
-          <w:rFonts w:ascii="Malgun Gothic" w:cs="Malgun Gothic" w:eastAsia="Malgun Gothic" w:hAnsi="Malgun Gothic"/>
-          <w:sz w:val="22"/>
-          <w:szCs w:val="22"/>
-        </w:rPr>
-        <w:t xml:space="preserve">세로형 비주얼 포스터 원본 비율 유지, 헤더 뱃지, 핵심 메타 정보(일시/장소/요금/문의처), 축제 소개, 주요 프로그램, 부대행사, 갤러리, 공식 홈페이지 링크의 구조 유지함.</w:t>
-      </w:r>
-    </w:p>
-    <w:p>
-      <w:pPr>
-        <w:pStyle w:val="ListParagraph"/>
-        <w:numPr>
-          <w:ilvl w:val="0"/>
-          <w:numId w:val="1"/>
-        </w:numPr>
-        <w:spacing w:after="60" w:before="60"/>
-      </w:pPr>
-      <w:r>
-        <w:rPr>
-          <w:rFonts w:ascii="Malgun Gothic" w:cs="Malgun Gothic" w:eastAsia="Malgun Gothic" w:hAnsi="Malgun Gothic"/>
-          <w:sz w:val="22"/>
-          <w:szCs w:val="22"/>
-        </w:rPr>
-        <w:t xml:space="preserve">데이터 부재 시에도 카드 컨테이너 영역을 항상 유지하여 레이아웃 일관성을 확보함.</w:t>
       </w:r>
     </w:p>
     <w:sectPr>

</xml_diff>